<commit_message>
Ajustes de Word v1.2
</commit_message>
<xml_diff>
--- a/docs/Microproyecto_Entrega1.docx
+++ b/docs/Microproyecto_Entrega1.docx
@@ -6,6 +6,7 @@
       <w:pPr>
         <w:pStyle w:val="Ttulo"/>
         <w:spacing w:after="80"/>
+        <w:jc w:val="center"/>
       </w:pPr>
       <w:proofErr w:type="spellStart"/>
       <w:r>
@@ -19,9 +20,7 @@
     <w:p>
       <w:pPr>
         <w:spacing w:after="60"/>
-      </w:pPr>
-      <w:proofErr w:type="spellStart"/>
-      <w:r>
+        <w:jc w:val="center"/>
         <w:rPr>
           <w:b/>
           <w:bCs/>
@@ -29,9 +28,8 @@
           <w:sz w:val="26"/>
           <w:szCs w:val="26"/>
         </w:rPr>
-        <w:t>DiabetesRisk</w:t>
-      </w:r>
-      <w:proofErr w:type="spellEnd"/>
+      </w:pPr>
+      <w:proofErr w:type="spellStart"/>
       <w:r>
         <w:rPr>
           <w:b/>
@@ -40,12 +38,171 @@
           <w:sz w:val="26"/>
           <w:szCs w:val="26"/>
         </w:rPr>
+        <w:t>DiabetesRisk</w:t>
+      </w:r>
+      <w:proofErr w:type="spellEnd"/>
+      <w:r>
+        <w:rPr>
+          <w:b/>
+          <w:bCs/>
+          <w:color w:val="0C447C"/>
+          <w:sz w:val="26"/>
+          <w:szCs w:val="26"/>
+        </w:rPr>
         <w:t>: tamizaje temprano de riesgo de diabetes tipo 2</w:t>
       </w:r>
     </w:p>
     <w:p>
       <w:pPr>
+        <w:spacing w:after="60"/>
+        <w:jc w:val="center"/>
+        <w:rPr>
+          <w:b/>
+          <w:bCs/>
+          <w:color w:val="0C447C"/>
+          <w:sz w:val="26"/>
+          <w:szCs w:val="26"/>
+        </w:rPr>
+      </w:pPr>
+    </w:p>
+    <w:p>
+      <w:pPr>
+        <w:spacing w:after="60"/>
+        <w:jc w:val="center"/>
+        <w:rPr>
+          <w:b/>
+          <w:bCs/>
+          <w:color w:val="0C447C"/>
+          <w:sz w:val="26"/>
+          <w:szCs w:val="26"/>
+        </w:rPr>
+      </w:pPr>
+    </w:p>
+    <w:p>
+      <w:pPr>
+        <w:spacing w:after="60"/>
+        <w:jc w:val="center"/>
+      </w:pPr>
+    </w:p>
+    <w:p>
+      <w:pPr>
         <w:spacing w:after="120"/>
+        <w:jc w:val="center"/>
+        <w:rPr>
+          <w:color w:val="5F5E5A"/>
+        </w:rPr>
+      </w:pPr>
+      <w:r>
+        <w:rPr>
+          <w:color w:val="5F5E5A"/>
+        </w:rPr>
+        <w:t xml:space="preserve">Equipo: </w:t>
+      </w:r>
+    </w:p>
+    <w:p>
+      <w:pPr>
+        <w:spacing w:after="120"/>
+        <w:jc w:val="center"/>
+      </w:pPr>
+      <w:r>
+        <w:rPr>
+          <w:color w:val="5F5E5A"/>
+        </w:rPr>
+        <w:t xml:space="preserve">Jared Foster Orduz, Jeferson David Vargas Toca, </w:t>
+      </w:r>
+      <w:proofErr w:type="spellStart"/>
+      <w:r>
+        <w:rPr>
+          <w:color w:val="5F5E5A"/>
+        </w:rPr>
+        <w:t>Andres</w:t>
+      </w:r>
+      <w:proofErr w:type="spellEnd"/>
+      <w:r>
+        <w:rPr>
+          <w:color w:val="5F5E5A"/>
+        </w:rPr>
+        <w:t xml:space="preserve"> Felipe </w:t>
+      </w:r>
+      <w:proofErr w:type="spellStart"/>
+      <w:r>
+        <w:rPr>
+          <w:color w:val="5F5E5A"/>
+        </w:rPr>
+        <w:t>Florez</w:t>
+      </w:r>
+      <w:proofErr w:type="spellEnd"/>
+      <w:r>
+        <w:rPr>
+          <w:color w:val="5F5E5A"/>
+        </w:rPr>
+        <w:t xml:space="preserve"> Garces, Oscar Enrique Morillo</w:t>
+      </w:r>
+    </w:p>
+    <w:p>
+      <w:pPr>
+        <w:spacing w:after="120"/>
+        <w:jc w:val="center"/>
+        <w:rPr>
+          <w:color w:val="5F5E5A"/>
+        </w:rPr>
+      </w:pPr>
+    </w:p>
+    <w:p>
+      <w:pPr>
+        <w:spacing w:after="120"/>
+        <w:jc w:val="center"/>
+        <w:rPr>
+          <w:color w:val="5F5E5A"/>
+        </w:rPr>
+      </w:pPr>
+    </w:p>
+    <w:p>
+      <w:pPr>
+        <w:spacing w:after="120"/>
+        <w:jc w:val="center"/>
+        <w:rPr>
+          <w:color w:val="5F5E5A"/>
+        </w:rPr>
+      </w:pPr>
+    </w:p>
+    <w:p>
+      <w:pPr>
+        <w:spacing w:after="120"/>
+        <w:jc w:val="center"/>
+        <w:rPr>
+          <w:color w:val="5F5E5A"/>
+        </w:rPr>
+      </w:pPr>
+    </w:p>
+    <w:p>
+      <w:pPr>
+        <w:spacing w:after="120"/>
+        <w:jc w:val="center"/>
+        <w:rPr>
+          <w:color w:val="5F5E5A"/>
+        </w:rPr>
+      </w:pPr>
+    </w:p>
+    <w:p>
+      <w:pPr>
+        <w:spacing w:after="120"/>
+        <w:jc w:val="center"/>
+        <w:rPr>
+          <w:color w:val="5F5E5A"/>
+        </w:rPr>
+      </w:pPr>
+      <w:r>
+        <w:rPr>
+          <w:color w:val="5F5E5A"/>
+        </w:rPr>
+        <w:t>Agosto de 2026</w:t>
+      </w:r>
+    </w:p>
+    <w:p>
+      <w:pPr>
+        <w:spacing w:after="120"/>
+        <w:jc w:val="center"/>
       </w:pPr>
       <w:r>
         <w:rPr>
@@ -57,51 +214,19 @@
     <w:p>
       <w:pPr>
         <w:spacing w:after="120"/>
-      </w:pPr>
-      <w:r>
-        <w:rPr>
-          <w:color w:val="5F5E5A"/>
-        </w:rPr>
-        <w:t xml:space="preserve">Equipo: Jared Foster Orduz, Jeferson David Vargas Toca, </w:t>
-      </w:r>
-      <w:proofErr w:type="spellStart"/>
-      <w:r>
-        <w:rPr>
-          <w:color w:val="5F5E5A"/>
-        </w:rPr>
-        <w:t>Andres</w:t>
-      </w:r>
-      <w:proofErr w:type="spellEnd"/>
-      <w:r>
-        <w:rPr>
-          <w:color w:val="5F5E5A"/>
-        </w:rPr>
-        <w:t xml:space="preserve"> Felipe </w:t>
-      </w:r>
-      <w:proofErr w:type="spellStart"/>
-      <w:r>
-        <w:rPr>
-          <w:color w:val="5F5E5A"/>
-        </w:rPr>
-        <w:t>Florez</w:t>
-      </w:r>
-      <w:proofErr w:type="spellEnd"/>
-      <w:r>
-        <w:rPr>
-          <w:color w:val="5F5E5A"/>
-        </w:rPr>
-        <w:t xml:space="preserve"> Garces, Oscar Enrique Morillo</w:t>
-      </w:r>
-    </w:p>
-    <w:p>
-      <w:pPr>
-        <w:spacing w:after="120"/>
-      </w:pPr>
-      <w:r>
-        <w:rPr>
-          <w:color w:val="5F5E5A"/>
-        </w:rPr>
-        <w:t>Agosto de 2026</w:t>
+        <w:jc w:val="center"/>
+      </w:pPr>
+    </w:p>
+    <w:p>
+      <w:pPr>
+        <w:rPr>
+          <w:color w:val="2E74B5"/>
+          <w:sz w:val="32"/>
+          <w:szCs w:val="32"/>
+        </w:rPr>
+      </w:pPr>
+      <w:r>
+        <w:br w:type="page"/>
       </w:r>
     </w:p>
     <w:p>
@@ -110,6 +235,7 @@
         <w:spacing w:before="240" w:after="120"/>
       </w:pPr>
       <w:r>
+        <w:lastRenderedPageBreak/>
         <w:t>1. Problema y contexto</w:t>
       </w:r>
     </w:p>
@@ -419,7 +545,6 @@
         <w:spacing w:after="60"/>
       </w:pPr>
       <w:r>
-        <w:lastRenderedPageBreak/>
         <w:t xml:space="preserve">Variables destacadas para el formulario del prototipo: BMI (IMC), Age (edad, en rangos BRFSS), </w:t>
       </w:r>
       <w:proofErr w:type="spellStart"/>
@@ -571,6 +696,7 @@
         <w:spacing w:before="200" w:after="100"/>
       </w:pPr>
       <w:r>
+        <w:lastRenderedPageBreak/>
         <w:t>4.1 Balance de clases</w:t>
       </w:r>
     </w:p>
@@ -584,9 +710,9 @@
           <w:noProof/>
         </w:rPr>
         <w:drawing>
-          <wp:inline distT="0" distB="0" distL="0" distR="0" wp14:anchorId="684CE905" wp14:editId="278E8EF1">
-            <wp:extent cx="4254500" cy="2978150"/>
-            <wp:effectExtent l="0" t="0" r="0" b="0"/>
+          <wp:inline distT="0" distB="0" distL="0" distR="0" wp14:anchorId="04F3FDAE" wp14:editId="77227F31">
+            <wp:extent cx="4184650" cy="2929255"/>
+            <wp:effectExtent l="0" t="0" r="6350" b="4445"/>
             <wp:docPr id="1" name="Imagen 1"/>
             <wp:cNvGraphicFramePr>
               <a:graphicFrameLocks xmlns:a="http://schemas.openxmlformats.org/drawingml/2006/main" noChangeAspect="1"/>
@@ -610,7 +736,7 @@
                   <pic:spPr bwMode="auto">
                     <a:xfrm>
                       <a:off x="0" y="0"/>
-                      <a:ext cx="4259826" cy="2981878"/>
+                      <a:ext cx="4184650" cy="2929255"/>
                     </a:xfrm>
                     <a:prstGeom prst="rect">
                       <a:avLst/>
@@ -703,12 +829,11 @@
         <w:rPr>
           <w:noProof/>
         </w:rPr>
-        <w:lastRenderedPageBreak/>
         <w:drawing>
-          <wp:inline distT="0" distB="0" distL="0" distR="0" wp14:anchorId="78BB731D" wp14:editId="00C0F127">
-            <wp:extent cx="4248150" cy="2973705"/>
-            <wp:effectExtent l="0" t="0" r="0" b="0"/>
-            <wp:docPr id="162072854" name="Imagen 162072854"/>
+          <wp:inline distT="0" distB="0" distL="0" distR="0" wp14:anchorId="02719F50" wp14:editId="50FDAA20">
+            <wp:extent cx="4165600" cy="2915920"/>
+            <wp:effectExtent l="0" t="0" r="6350" b="0"/>
+            <wp:docPr id="1153083404" name="Imagen 1153083404"/>
             <wp:cNvGraphicFramePr>
               <a:graphicFrameLocks xmlns:a="http://schemas.openxmlformats.org/drawingml/2006/main" noChangeAspect="1"/>
             </wp:cNvGraphicFramePr>
@@ -731,7 +856,7 @@
                   <pic:spPr bwMode="auto">
                     <a:xfrm>
                       <a:off x="0" y="0"/>
-                      <a:ext cx="4248401" cy="2973881"/>
+                      <a:ext cx="4174949" cy="2922464"/>
                     </a:xfrm>
                     <a:prstGeom prst="rect">
                       <a:avLst/>
@@ -786,11 +911,12 @@
         <w:rPr>
           <w:noProof/>
         </w:rPr>
+        <w:lastRenderedPageBreak/>
         <w:drawing>
-          <wp:inline distT="0" distB="0" distL="0" distR="0" wp14:anchorId="7C085087" wp14:editId="027B3AED">
-            <wp:extent cx="4565135" cy="2667000"/>
-            <wp:effectExtent l="0" t="0" r="6985" b="0"/>
-            <wp:docPr id="1168046952" name="Imagen 1168046952"/>
+          <wp:inline distT="0" distB="0" distL="0" distR="0" wp14:anchorId="096E025B" wp14:editId="1ECD38A2">
+            <wp:extent cx="4686300" cy="2737786"/>
+            <wp:effectExtent l="0" t="0" r="0" b="5715"/>
+            <wp:docPr id="2060153499" name="Imagen 2060153499"/>
             <wp:cNvGraphicFramePr>
               <a:graphicFrameLocks xmlns:a="http://schemas.openxmlformats.org/drawingml/2006/main" noChangeAspect="1"/>
             </wp:cNvGraphicFramePr>
@@ -813,7 +939,7 @@
                   <pic:spPr bwMode="auto">
                     <a:xfrm>
                       <a:off x="0" y="0"/>
-                      <a:ext cx="4572177" cy="2671114"/>
+                      <a:ext cx="4701524" cy="2746680"/>
                     </a:xfrm>
                     <a:prstGeom prst="rect">
                       <a:avLst/>
@@ -868,12 +994,11 @@
         <w:rPr>
           <w:noProof/>
         </w:rPr>
-        <w:lastRenderedPageBreak/>
         <w:drawing>
-          <wp:inline distT="0" distB="0" distL="0" distR="0" wp14:anchorId="1C674BB4" wp14:editId="1C8F1688">
-            <wp:extent cx="4279855" cy="3562350"/>
-            <wp:effectExtent l="0" t="0" r="6985" b="0"/>
-            <wp:docPr id="162786803" name="Imagen 162786803"/>
+          <wp:inline distT="0" distB="0" distL="0" distR="0" wp14:anchorId="7C020A66" wp14:editId="355ACD88">
+            <wp:extent cx="4914900" cy="4090931"/>
+            <wp:effectExtent l="0" t="0" r="0" b="5080"/>
+            <wp:docPr id="1511670541" name="Imagen 1511670541"/>
             <wp:cNvGraphicFramePr>
               <a:graphicFrameLocks xmlns:a="http://schemas.openxmlformats.org/drawingml/2006/main" noChangeAspect="1"/>
             </wp:cNvGraphicFramePr>
@@ -896,7 +1021,7 @@
                   <pic:spPr bwMode="auto">
                     <a:xfrm>
                       <a:off x="0" y="0"/>
-                      <a:ext cx="4289080" cy="3570029"/>
+                      <a:ext cx="4922281" cy="4097074"/>
                     </a:xfrm>
                     <a:prstGeom prst="rect">
                       <a:avLst/>
@@ -1012,15 +1137,12 @@
       </w:r>
     </w:p>
     <w:p>
+      <w:pPr>
+        <w:pStyle w:val="Ttulo1"/>
+      </w:pPr>
       <w:r>
         <w:br w:type="page"/>
       </w:r>
-    </w:p>
-    <w:p>
-      <w:pPr>
-        <w:pStyle w:val="Ttulo1"/>
-        <w:spacing w:before="240" w:after="120"/>
-      </w:pPr>
       <w:r>
         <w:lastRenderedPageBreak/>
         <w:t>5. Maqueta (mockup) del prototipo</w:t>
@@ -1041,10 +1163,10 @@
       </w:pPr>
       <w:r>
         <w:drawing>
-          <wp:inline distT="0" distB="0" distL="0" distR="0" wp14:anchorId="5B8DC772" wp14:editId="69293827">
-            <wp:extent cx="5188217" cy="3638737"/>
+          <wp:inline distT="0" distB="0" distL="0" distR="0" wp14:anchorId="352967D3" wp14:editId="1080CDFD">
+            <wp:extent cx="5302523" cy="3714941"/>
             <wp:effectExtent l="0" t="0" r="0" b="0"/>
-            <wp:docPr id="637387722" name="Imagen 1"/>
+            <wp:docPr id="216376266" name="Imagen 1"/>
             <wp:cNvGraphicFramePr>
               <a:graphicFrameLocks xmlns:a="http://schemas.openxmlformats.org/drawingml/2006/main" noChangeAspect="1"/>
             </wp:cNvGraphicFramePr>
@@ -1052,7 +1174,7 @@
               <a:graphicData uri="http://schemas.openxmlformats.org/drawingml/2006/picture">
                 <pic:pic xmlns:pic="http://schemas.openxmlformats.org/drawingml/2006/picture">
                   <pic:nvPicPr>
-                    <pic:cNvPr id="637387722" name=""/>
+                    <pic:cNvPr id="216376266" name=""/>
                     <pic:cNvPicPr/>
                   </pic:nvPicPr>
                   <pic:blipFill>
@@ -1064,7 +1186,7 @@
                   <pic:spPr>
                     <a:xfrm>
                       <a:off x="0" y="0"/>
-                      <a:ext cx="5188217" cy="3638737"/>
+                      <a:ext cx="5302523" cy="3714941"/>
                     </a:xfrm>
                     <a:prstGeom prst="rect">
                       <a:avLst/>
@@ -1494,23 +1616,32 @@
       </w:r>
       <w:proofErr w:type="spellEnd"/>
       <w:r>
-        <w:t>)</w:t>
-      </w:r>
-      <w:r>
-        <w:t>,</w:t>
-      </w:r>
-      <w:r>
-        <w:t xml:space="preserve"> Los comandos ejecutados fueron:</w:t>
-      </w:r>
-    </w:p>
-    <w:p>
-      <w:pPr>
+        <w:t xml:space="preserve">), creado y administrado por Jared Foster Orduz (arquitecto </w:t>
+      </w:r>
+      <w:proofErr w:type="spellStart"/>
+      <w:r>
+        <w:t>cloud</w:t>
+      </w:r>
+      <w:proofErr w:type="spellEnd"/>
+      <w:r>
+        <w:t xml:space="preserve"> del equipo). Los comandos ejecutados fueron:</w:t>
+      </w:r>
+    </w:p>
+    <w:p>
+      <w:pPr>
+        <w:shd w:val="clear" w:color="auto" w:fill="F2F2F2" w:themeFill="background1" w:themeFillShade="F2"/>
         <w:spacing w:after="20"/>
+        <w:rPr>
+          <w:sz w:val="18"/>
+          <w:szCs w:val="18"/>
+        </w:rPr>
       </w:pPr>
       <w:proofErr w:type="spellStart"/>
       <w:r>
         <w:rPr>
           <w:rFonts w:ascii="Consolas" w:eastAsia="Consolas" w:hAnsi="Consolas" w:cs="Consolas"/>
+          <w:sz w:val="18"/>
+          <w:szCs w:val="18"/>
         </w:rPr>
         <w:t>aws</w:t>
       </w:r>
@@ -1518,18 +1649,27 @@
       <w:r>
         <w:rPr>
           <w:rFonts w:ascii="Consolas" w:eastAsia="Consolas" w:hAnsi="Consolas" w:cs="Consolas"/>
+          <w:sz w:val="18"/>
+          <w:szCs w:val="18"/>
         </w:rPr>
         <w:t xml:space="preserve"> configure    # credenciales AWS del equipo</w:t>
       </w:r>
     </w:p>
     <w:p>
       <w:pPr>
+        <w:shd w:val="clear" w:color="auto" w:fill="F2F2F2" w:themeFill="background1" w:themeFillShade="F2"/>
         <w:spacing w:after="20"/>
+        <w:rPr>
+          <w:sz w:val="18"/>
+          <w:szCs w:val="18"/>
+        </w:rPr>
       </w:pPr>
       <w:proofErr w:type="spellStart"/>
       <w:r>
         <w:rPr>
           <w:rFonts w:ascii="Consolas" w:eastAsia="Consolas" w:hAnsi="Consolas" w:cs="Consolas"/>
+          <w:sz w:val="18"/>
+          <w:szCs w:val="18"/>
         </w:rPr>
         <w:t>dvc</w:t>
       </w:r>
@@ -1537,6 +1677,8 @@
       <w:r>
         <w:rPr>
           <w:rFonts w:ascii="Consolas" w:eastAsia="Consolas" w:hAnsi="Consolas" w:cs="Consolas"/>
+          <w:sz w:val="18"/>
+          <w:szCs w:val="18"/>
         </w:rPr>
         <w:t xml:space="preserve"> </w:t>
       </w:r>
@@ -1544,6 +1686,8 @@
       <w:r>
         <w:rPr>
           <w:rFonts w:ascii="Consolas" w:eastAsia="Consolas" w:hAnsi="Consolas" w:cs="Consolas"/>
+          <w:sz w:val="18"/>
+          <w:szCs w:val="18"/>
         </w:rPr>
         <w:t>init</w:t>
       </w:r>
@@ -1551,8 +1695,11 @@
     </w:p>
     <w:p>
       <w:pPr>
+        <w:shd w:val="clear" w:color="auto" w:fill="F2F2F2" w:themeFill="background1" w:themeFillShade="F2"/>
         <w:spacing w:after="20"/>
         <w:rPr>
+          <w:sz w:val="18"/>
+          <w:szCs w:val="18"/>
           <w:lang w:val="en-US"/>
         </w:rPr>
       </w:pPr>
@@ -1560,6 +1707,8 @@
       <w:r>
         <w:rPr>
           <w:rFonts w:ascii="Consolas" w:eastAsia="Consolas" w:hAnsi="Consolas" w:cs="Consolas"/>
+          <w:sz w:val="18"/>
+          <w:szCs w:val="18"/>
           <w:lang w:val="en-US"/>
         </w:rPr>
         <w:t>dvc</w:t>
@@ -1568,6 +1717,8 @@
       <w:r>
         <w:rPr>
           <w:rFonts w:ascii="Consolas" w:eastAsia="Consolas" w:hAnsi="Consolas" w:cs="Consolas"/>
+          <w:sz w:val="18"/>
+          <w:szCs w:val="18"/>
           <w:lang w:val="en-US"/>
         </w:rPr>
         <w:t xml:space="preserve"> remote add -d </w:t>
@@ -1576,6 +1727,8 @@
       <w:r>
         <w:rPr>
           <w:rFonts w:ascii="Consolas" w:eastAsia="Consolas" w:hAnsi="Consolas" w:cs="Consolas"/>
+          <w:sz w:val="18"/>
+          <w:szCs w:val="18"/>
           <w:lang w:val="en-US"/>
         </w:rPr>
         <w:t>aws</w:t>
@@ -1584,6 +1737,8 @@
       <w:r>
         <w:rPr>
           <w:rFonts w:ascii="Consolas" w:eastAsia="Consolas" w:hAnsi="Consolas" w:cs="Consolas"/>
+          <w:sz w:val="18"/>
+          <w:szCs w:val="18"/>
           <w:lang w:val="en-US"/>
         </w:rPr>
         <w:t>-remote s3://diabetesrisk-dvcstore</w:t>
@@ -1591,8 +1746,11 @@
     </w:p>
     <w:p>
       <w:pPr>
+        <w:shd w:val="clear" w:color="auto" w:fill="F2F2F2" w:themeFill="background1" w:themeFillShade="F2"/>
         <w:spacing w:after="20"/>
         <w:rPr>
+          <w:sz w:val="18"/>
+          <w:szCs w:val="18"/>
           <w:lang w:val="en-US"/>
         </w:rPr>
       </w:pPr>
@@ -1600,6 +1758,8 @@
       <w:r>
         <w:rPr>
           <w:rFonts w:ascii="Consolas" w:eastAsia="Consolas" w:hAnsi="Consolas" w:cs="Consolas"/>
+          <w:sz w:val="18"/>
+          <w:szCs w:val="18"/>
           <w:lang w:val="en-US"/>
         </w:rPr>
         <w:t>dvc</w:t>
@@ -1608,6 +1768,8 @@
       <w:r>
         <w:rPr>
           <w:rFonts w:ascii="Consolas" w:eastAsia="Consolas" w:hAnsi="Consolas" w:cs="Consolas"/>
+          <w:sz w:val="18"/>
+          <w:szCs w:val="18"/>
           <w:lang w:val="en-US"/>
         </w:rPr>
         <w:t xml:space="preserve"> add data/diabetes_binary_health_indicators_BRFSS2015.csv</w:t>
@@ -1615,14 +1777,19 @@
     </w:p>
     <w:p>
       <w:pPr>
+        <w:shd w:val="clear" w:color="auto" w:fill="F2F2F2" w:themeFill="background1" w:themeFillShade="F2"/>
         <w:spacing w:after="20"/>
         <w:rPr>
+          <w:sz w:val="18"/>
+          <w:szCs w:val="18"/>
           <w:lang w:val="en-US"/>
         </w:rPr>
       </w:pPr>
       <w:r>
         <w:rPr>
           <w:rFonts w:ascii="Consolas" w:eastAsia="Consolas" w:hAnsi="Consolas" w:cs="Consolas"/>
+          <w:sz w:val="18"/>
+          <w:szCs w:val="18"/>
           <w:lang w:val="en-US"/>
         </w:rPr>
         <w:t xml:space="preserve">git add </w:t>
@@ -1631,6 +1798,8 @@
       <w:r>
         <w:rPr>
           <w:rFonts w:ascii="Consolas" w:eastAsia="Consolas" w:hAnsi="Consolas" w:cs="Consolas"/>
+          <w:sz w:val="18"/>
+          <w:szCs w:val="18"/>
           <w:lang w:val="en-US"/>
         </w:rPr>
         <w:t>data/*.</w:t>
@@ -1639,6 +1808,8 @@
       <w:r>
         <w:rPr>
           <w:rFonts w:ascii="Consolas" w:eastAsia="Consolas" w:hAnsi="Consolas" w:cs="Consolas"/>
+          <w:sz w:val="18"/>
+          <w:szCs w:val="18"/>
           <w:lang w:val="en-US"/>
         </w:rPr>
         <w:t>dvc</w:t>
@@ -1647,6 +1818,8 @@
       <w:r>
         <w:rPr>
           <w:rFonts w:ascii="Consolas" w:eastAsia="Consolas" w:hAnsi="Consolas" w:cs="Consolas"/>
+          <w:sz w:val="18"/>
+          <w:szCs w:val="18"/>
           <w:lang w:val="en-US"/>
         </w:rPr>
         <w:t xml:space="preserve"> .</w:t>
@@ -1655,6 +1828,8 @@
       <w:r>
         <w:rPr>
           <w:rFonts w:ascii="Consolas" w:eastAsia="Consolas" w:hAnsi="Consolas" w:cs="Consolas"/>
+          <w:sz w:val="18"/>
+          <w:szCs w:val="18"/>
           <w:lang w:val="en-US"/>
         </w:rPr>
         <w:t>dvc</w:t>
@@ -1664,6 +1839,8 @@
       <w:r>
         <w:rPr>
           <w:rFonts w:ascii="Consolas" w:eastAsia="Consolas" w:hAnsi="Consolas" w:cs="Consolas"/>
+          <w:sz w:val="18"/>
+          <w:szCs w:val="18"/>
           <w:lang w:val="en-US"/>
         </w:rPr>
         <w:t>/</w:t>
@@ -1672,6 +1849,8 @@
       <w:r>
         <w:rPr>
           <w:rFonts w:ascii="Consolas" w:eastAsia="Consolas" w:hAnsi="Consolas" w:cs="Consolas"/>
+          <w:sz w:val="18"/>
+          <w:szCs w:val="18"/>
           <w:lang w:val="en-US"/>
         </w:rPr>
         <w:t>config .</w:t>
@@ -1680,6 +1859,8 @@
       <w:r>
         <w:rPr>
           <w:rFonts w:ascii="Consolas" w:eastAsia="Consolas" w:hAnsi="Consolas" w:cs="Consolas"/>
+          <w:sz w:val="18"/>
+          <w:szCs w:val="18"/>
           <w:lang w:val="en-US"/>
         </w:rPr>
         <w:t>gitignore</w:t>
@@ -1689,12 +1870,19 @@
     </w:p>
     <w:p>
       <w:pPr>
+        <w:shd w:val="clear" w:color="auto" w:fill="F2F2F2" w:themeFill="background1" w:themeFillShade="F2"/>
         <w:spacing w:after="20"/>
+        <w:rPr>
+          <w:sz w:val="18"/>
+          <w:szCs w:val="18"/>
+        </w:rPr>
       </w:pPr>
       <w:proofErr w:type="spellStart"/>
       <w:r>
         <w:rPr>
           <w:rFonts w:ascii="Consolas" w:eastAsia="Consolas" w:hAnsi="Consolas" w:cs="Consolas"/>
+          <w:sz w:val="18"/>
+          <w:szCs w:val="18"/>
         </w:rPr>
         <w:t>git</w:t>
       </w:r>
@@ -1702,6 +1890,8 @@
       <w:r>
         <w:rPr>
           <w:rFonts w:ascii="Consolas" w:eastAsia="Consolas" w:hAnsi="Consolas" w:cs="Consolas"/>
+          <w:sz w:val="18"/>
+          <w:szCs w:val="18"/>
         </w:rPr>
         <w:t xml:space="preserve"> </w:t>
       </w:r>
@@ -1709,6 +1899,8 @@
       <w:r>
         <w:rPr>
           <w:rFonts w:ascii="Consolas" w:eastAsia="Consolas" w:hAnsi="Consolas" w:cs="Consolas"/>
+          <w:sz w:val="18"/>
+          <w:szCs w:val="18"/>
         </w:rPr>
         <w:t>commit</w:t>
       </w:r>
@@ -1716,6 +1908,8 @@
       <w:r>
         <w:rPr>
           <w:rFonts w:ascii="Consolas" w:eastAsia="Consolas" w:hAnsi="Consolas" w:cs="Consolas"/>
+          <w:sz w:val="18"/>
+          <w:szCs w:val="18"/>
         </w:rPr>
         <w:t xml:space="preserve"> -m "Inicializar DVC y versionar </w:t>
       </w:r>
@@ -1723,6 +1917,8 @@
       <w:r>
         <w:rPr>
           <w:rFonts w:ascii="Consolas" w:eastAsia="Consolas" w:hAnsi="Consolas" w:cs="Consolas"/>
+          <w:sz w:val="18"/>
+          <w:szCs w:val="18"/>
         </w:rPr>
         <w:t>dataset</w:t>
       </w:r>
@@ -1730,20 +1926,27 @@
       <w:r>
         <w:rPr>
           <w:rFonts w:ascii="Consolas" w:eastAsia="Consolas" w:hAnsi="Consolas" w:cs="Consolas"/>
+          <w:sz w:val="18"/>
+          <w:szCs w:val="18"/>
         </w:rPr>
         <w:t>"</w:t>
       </w:r>
     </w:p>
     <w:p>
       <w:pPr>
+        <w:shd w:val="clear" w:color="auto" w:fill="F2F2F2" w:themeFill="background1" w:themeFillShade="F2"/>
         <w:spacing w:after="20"/>
         <w:rPr>
+          <w:sz w:val="18"/>
+          <w:szCs w:val="18"/>
           <w:lang w:val="en-US"/>
         </w:rPr>
       </w:pPr>
       <w:r>
         <w:rPr>
           <w:rFonts w:ascii="Consolas" w:eastAsia="Consolas" w:hAnsi="Consolas" w:cs="Consolas"/>
+          <w:sz w:val="18"/>
+          <w:szCs w:val="18"/>
           <w:lang w:val="en-US"/>
         </w:rPr>
         <w:t>git push origin main</w:t>
@@ -1751,8 +1954,11 @@
     </w:p>
     <w:p>
       <w:pPr>
+        <w:shd w:val="clear" w:color="auto" w:fill="F2F2F2" w:themeFill="background1" w:themeFillShade="F2"/>
         <w:spacing w:after="20"/>
         <w:rPr>
+          <w:sz w:val="18"/>
+          <w:szCs w:val="18"/>
           <w:lang w:val="en-US"/>
         </w:rPr>
       </w:pPr>
@@ -1760,6 +1966,8 @@
       <w:r>
         <w:rPr>
           <w:rFonts w:ascii="Consolas" w:eastAsia="Consolas" w:hAnsi="Consolas" w:cs="Consolas"/>
+          <w:sz w:val="18"/>
+          <w:szCs w:val="18"/>
           <w:lang w:val="en-US"/>
         </w:rPr>
         <w:t>dvc</w:t>
@@ -1768,6 +1976,8 @@
       <w:r>
         <w:rPr>
           <w:rFonts w:ascii="Consolas" w:eastAsia="Consolas" w:hAnsi="Consolas" w:cs="Consolas"/>
+          <w:sz w:val="18"/>
+          <w:szCs w:val="18"/>
           <w:lang w:val="en-US"/>
         </w:rPr>
         <w:t xml:space="preserve"> push</w:t>
@@ -1800,10 +2010,10 @@
           <w:noProof/>
         </w:rPr>
         <w:drawing>
-          <wp:inline distT="0" distB="0" distL="0" distR="0" wp14:anchorId="5FC60D84" wp14:editId="64972BD1">
-            <wp:extent cx="5886622" cy="3111500"/>
-            <wp:effectExtent l="0" t="0" r="0" b="0"/>
-            <wp:docPr id="68282855" name="Imagen 68282855"/>
+          <wp:inline distT="0" distB="0" distL="0" distR="0" wp14:anchorId="0BEEE339" wp14:editId="2BA9D744">
+            <wp:extent cx="5467350" cy="2889885"/>
+            <wp:effectExtent l="0" t="0" r="0" b="5715"/>
+            <wp:docPr id="1720019005" name="Imagen 1720019005"/>
             <wp:cNvGraphicFramePr>
               <a:graphicFrameLocks xmlns:a="http://schemas.openxmlformats.org/drawingml/2006/main" noChangeAspect="1"/>
             </wp:cNvGraphicFramePr>
@@ -1826,7 +2036,7 @@
                   <pic:spPr bwMode="auto">
                     <a:xfrm>
                       <a:off x="0" y="0"/>
-                      <a:ext cx="5892934" cy="3114836"/>
+                      <a:ext cx="5484517" cy="2898959"/>
                     </a:xfrm>
                     <a:prstGeom prst="rect">
                       <a:avLst/>
@@ -1888,10 +2098,10 @@
         </w:rPr>
         <w:lastRenderedPageBreak/>
         <w:drawing>
-          <wp:inline distT="0" distB="0" distL="0" distR="0" wp14:anchorId="6D85F293" wp14:editId="4B1A3147">
-            <wp:extent cx="5989449" cy="3365500"/>
-            <wp:effectExtent l="0" t="0" r="0" b="6350"/>
-            <wp:docPr id="597676218" name="Imagen 597676218"/>
+          <wp:inline distT="0" distB="0" distL="0" distR="0" wp14:anchorId="32127EA7" wp14:editId="06DDF4F3">
+            <wp:extent cx="5661725" cy="3181350"/>
+            <wp:effectExtent l="0" t="0" r="0" b="0"/>
+            <wp:docPr id="1877890562" name="Imagen 1877890562"/>
             <wp:cNvGraphicFramePr>
               <a:graphicFrameLocks xmlns:a="http://schemas.openxmlformats.org/drawingml/2006/main" noChangeAspect="1"/>
             </wp:cNvGraphicFramePr>
@@ -1914,7 +2124,7 @@
                   <pic:spPr bwMode="auto">
                     <a:xfrm>
                       <a:off x="0" y="0"/>
-                      <a:ext cx="6004645" cy="3374039"/>
+                      <a:ext cx="5673073" cy="3187727"/>
                     </a:xfrm>
                     <a:prstGeom prst="rect">
                       <a:avLst/>
@@ -2063,10 +2273,10 @@
           <w:noProof/>
         </w:rPr>
         <w:drawing>
-          <wp:inline distT="0" distB="0" distL="0" distR="0" wp14:anchorId="19ED76C9" wp14:editId="22C65E64">
-            <wp:extent cx="5976938" cy="3187700"/>
-            <wp:effectExtent l="0" t="0" r="5080" b="0"/>
-            <wp:docPr id="1329797667" name="Imagen 1329797667"/>
+          <wp:inline distT="0" distB="0" distL="0" distR="0" wp14:anchorId="0F2F4C1A" wp14:editId="04E85FF4">
+            <wp:extent cx="5619750" cy="2997200"/>
+            <wp:effectExtent l="0" t="0" r="0" b="0"/>
+            <wp:docPr id="1258104164" name="Imagen 1258104164"/>
             <wp:cNvGraphicFramePr>
               <a:graphicFrameLocks xmlns:a="http://schemas.openxmlformats.org/drawingml/2006/main" noChangeAspect="1"/>
             </wp:cNvGraphicFramePr>
@@ -2089,7 +2299,7 @@
                   <pic:spPr bwMode="auto">
                     <a:xfrm>
                       <a:off x="0" y="0"/>
-                      <a:ext cx="5986600" cy="3192853"/>
+                      <a:ext cx="5631692" cy="3003569"/>
                     </a:xfrm>
                     <a:prstGeom prst="rect">
                       <a:avLst/>
@@ -2274,10 +2484,10 @@
 <file path=word/numbering.xml><?xml version="1.0" encoding="utf-8"?>
 <w:numbering xmlns:wpc="http://schemas.microsoft.com/office/word/2010/wordprocessingCanvas" xmlns:cx="http://schemas.microsoft.com/office/drawing/2014/chartex" xmlns:cx1="http://schemas.microsoft.com/office/drawing/2015/9/8/chartex" xmlns:cx2="http://schemas.microsoft.com/office/drawing/2015/10/21/chartex" xmlns:cx3="http://schemas.microsoft.com/office/drawing/2016/5/9/chartex" xmlns:cx4="http://schemas.microsoft.com/office/drawing/2016/5/10/chartex" xmlns:cx5="http://schemas.microsoft.com/office/drawing/2016/5/11/chartex" xmlns:cx6="http://schemas.microsoft.com/office/drawing/2016/5/12/chartex" xmlns:cx7="http://schemas.microsoft.com/office/drawing/2016/5/13/chartex" xmlns:cx8="http://schemas.microsoft.com/office/drawing/2016/5/14/chartex" xmlns:mc="http://schemas.openxmlformats.org/markup-compatibility/2006" xmlns:aink="http://schemas.microsoft.com/office/drawing/2016/ink" xmlns:am3d="http://schemas.microsoft.com/office/drawing/2017/model3d" xmlns:o="urn:schemas-microsoft-com:office:office" xmlns:oel="http://schemas.microsoft.com/office/2019/extlst" xmlns:r="http://schemas.openxmlformats.org/officeDocument/2006/relationships" xmlns:m="http://schemas.openxmlformats.org/officeDocument/2006/math" xmlns:v="urn:schemas-microsoft-com:vml" xmlns:wp14="http://schemas.microsoft.com/office/word/2010/wordprocessingDrawing" xmlns:wp="http://schemas.openxmlformats.org/drawingml/2006/wordprocessingDrawing" xmlns:w10="urn:schemas-microsoft-com:office:word" xmlns:w="http://schemas.openxmlformats.org/wordprocessingml/2006/main" xmlns:w14="http://schemas.microsoft.com/office/word/2010/wordml" xmlns:w15="http://schemas.microsoft.com/office/word/2012/wordml" xmlns:w16cei="http://schemas.microsoft.com/office/word/2026/wordml/cei" xmlns:w16cex="http://schemas.microsoft.com/office/word/2018/wordml/cex" xmlns:w16cid="http://schemas.microsoft.com/office/word/2016/wordml/cid" xmlns:w16="http://schemas.microsoft.com/office/word/2018/wordml" xmlns:w16du="http://schemas.microsoft.com/office/word/2023/wordml/word16du" xmlns:w16sdtdh="http://schemas.microsoft.com/office/word/2020/wordml/sdtdatahash" xmlns:w16sdtfl="http://schemas.microsoft.com/office/word/2024/wordml/sdtformatlock" xmlns:w16se="http://schemas.microsoft.com/office/word/2015/wordml/symex" xmlns:wpg="http://schemas.microsoft.com/office/word/2010/wordprocessingGroup" xmlns:wpi="http://schemas.microsoft.com/office/word/2010/wordprocessingInk" xmlns:wne="http://schemas.microsoft.com/office/word/2006/wordml" xmlns:wps="http://schemas.microsoft.com/office/word/2010/wordprocessingShape" mc:Ignorable="w14 w15 w16se w16cid w16 w16cex w16sdtdh w16sdtfl w16du wp14">
   <w:abstractNum w:abstractNumId="0" w15:restartNumberingAfterBreak="0">
-    <w:nsid w:val="2D443D8B"/>
+    <w:nsid w:val="1E5A1F38"/>
     <w:multiLevelType w:val="hybridMultilevel"/>
-    <w:tmpl w:val="DCDA176E"/>
-    <w:lvl w:ilvl="0" w:tplc="459A9DEA">
+    <w:tmpl w:val="712AB0EC"/>
+    <w:lvl w:ilvl="0" w:tplc="DD162EF6">
       <w:start w:val="1"/>
       <w:numFmt w:val="bullet"/>
       <w:lvlText w:val="●"/>
@@ -2286,7 +2496,7 @@
         <w:ind w:left="720" w:hanging="360"/>
       </w:pPr>
     </w:lvl>
-    <w:lvl w:ilvl="1" w:tplc="A2FE9988">
+    <w:lvl w:ilvl="1" w:tplc="00C4A642">
       <w:start w:val="1"/>
       <w:numFmt w:val="bullet"/>
       <w:lvlText w:val="○"/>
@@ -2295,7 +2505,7 @@
         <w:ind w:left="1440" w:hanging="360"/>
       </w:pPr>
     </w:lvl>
-    <w:lvl w:ilvl="2" w:tplc="A3A47950">
+    <w:lvl w:ilvl="2" w:tplc="D272F06E">
       <w:start w:val="1"/>
       <w:numFmt w:val="bullet"/>
       <w:lvlText w:val="■"/>
@@ -2304,7 +2514,7 @@
         <w:ind w:left="2160" w:hanging="360"/>
       </w:pPr>
     </w:lvl>
-    <w:lvl w:ilvl="3" w:tplc="5D9A34F6">
+    <w:lvl w:ilvl="3" w:tplc="644C0C72">
       <w:start w:val="1"/>
       <w:numFmt w:val="bullet"/>
       <w:lvlText w:val="●"/>
@@ -2313,7 +2523,7 @@
         <w:ind w:left="2880" w:hanging="360"/>
       </w:pPr>
     </w:lvl>
-    <w:lvl w:ilvl="4" w:tplc="0DDE5560">
+    <w:lvl w:ilvl="4" w:tplc="E72AFB76">
       <w:start w:val="1"/>
       <w:numFmt w:val="bullet"/>
       <w:lvlText w:val="○"/>
@@ -2322,7 +2532,7 @@
         <w:ind w:left="3600" w:hanging="360"/>
       </w:pPr>
     </w:lvl>
-    <w:lvl w:ilvl="5" w:tplc="9ACCF8C8">
+    <w:lvl w:ilvl="5" w:tplc="67302D70">
       <w:start w:val="1"/>
       <w:numFmt w:val="bullet"/>
       <w:lvlText w:val="■"/>
@@ -2331,7 +2541,7 @@
         <w:ind w:left="4320" w:hanging="360"/>
       </w:pPr>
     </w:lvl>
-    <w:lvl w:ilvl="6" w:tplc="973AF66C">
+    <w:lvl w:ilvl="6" w:tplc="6C36BF42">
       <w:start w:val="1"/>
       <w:numFmt w:val="bullet"/>
       <w:lvlText w:val="●"/>
@@ -2340,7 +2550,7 @@
         <w:ind w:left="5040" w:hanging="360"/>
       </w:pPr>
     </w:lvl>
-    <w:lvl w:ilvl="7" w:tplc="1E506E48">
+    <w:lvl w:ilvl="7" w:tplc="B90A4C02">
       <w:start w:val="1"/>
       <w:numFmt w:val="bullet"/>
       <w:lvlText w:val="●"/>
@@ -2349,7 +2559,7 @@
         <w:ind w:left="5760" w:hanging="360"/>
       </w:pPr>
     </w:lvl>
-    <w:lvl w:ilvl="8" w:tplc="4B461776">
+    <w:lvl w:ilvl="8" w:tplc="81727746">
       <w:start w:val="1"/>
       <w:numFmt w:val="bullet"/>
       <w:lvlText w:val="●"/>
@@ -2359,7 +2569,7 @@
       </w:pPr>
     </w:lvl>
   </w:abstractNum>
-  <w:num w:numId="1" w16cid:durableId="374501463">
+  <w:num w:numId="1" w16cid:durableId="591625979">
     <w:abstractNumId w:val="0"/>
     <w:lvlOverride w:ilvl="0">
       <w:startOverride w:val="1"/>

</xml_diff>